<commit_message>
Big Update 90 %
</commit_message>
<xml_diff>
--- a/public/wordTemplate/lampiran_a_template.docx
+++ b/public/wordTemplate/lampiran_a_template.docx
@@ -1,15 +1,20 @@
 
 <file path=word/document.xml><?xml version="1.0" encoding="utf-8"?>
-<w:document xmlns:wpc="http://schemas.microsoft.com/office/word/2010/wordprocessingCanvas" xmlns:cx="http://schemas.microsoft.com/office/drawing/2014/chartex" xmlns:cx1="http://schemas.microsoft.com/office/drawing/2015/9/8/chartex" xmlns:cx2="http://schemas.microsoft.com/office/drawing/2015/10/21/chartex" xmlns:cx3="http://schemas.microsoft.com/office/drawing/2016/5/9/chartex" xmlns:cx4="http://schemas.microsoft.com/office/drawing/2016/5/10/chartex" xmlns:cx5="http://schemas.microsoft.com/office/drawing/2016/5/11/chartex" xmlns:cx6="http://schemas.microsoft.com/office/drawing/2016/5/12/chartex" xmlns:cx7="http://schemas.microsoft.com/office/drawing/2016/5/13/chartex" xmlns:cx8="http://schemas.microsoft.com/office/drawing/2016/5/14/chartex" xmlns:mc="http://schemas.openxmlformats.org/markup-compatibility/2006" xmlns:aink="http://schemas.microsoft.com/office/drawing/2016/ink" xmlns:am3d="http://schemas.microsoft.com/office/drawing/2017/model3d" xmlns:o="urn:schemas-microsoft-com:office:office" xmlns:oel="http://schemas.microsoft.com/office/2019/extlst" xmlns:r="http://schemas.openxmlformats.org/officeDocument/2006/relationships" xmlns:m="http://schemas.openxmlformats.org/officeDocument/2006/math" xmlns:v="urn:schemas-microsoft-com:vml" xmlns:wp14="http://schemas.microsoft.com/office/word/2010/wordprocessingDrawing" xmlns:wp="http://schemas.openxmlformats.org/drawingml/2006/wordprocessingDrawing" xmlns:w10="urn:schemas-microsoft-com:office:word" xmlns:w="http://schemas.openxmlformats.org/wordprocessingml/2006/main" xmlns:w14="http://schemas.microsoft.com/office/word/2010/wordml" xmlns:w15="http://schemas.microsoft.com/office/word/2012/wordml" xmlns:w16cex="http://schemas.microsoft.com/office/word/2018/wordml/cex" xmlns:w16cid="http://schemas.microsoft.com/office/word/2016/wordml/cid" xmlns:w16="http://schemas.microsoft.com/office/word/2018/wordml" xmlns:w16sdtdh="http://schemas.microsoft.com/office/word/2020/wordml/sdtdatahash" xmlns:w16se="http://schemas.microsoft.com/office/word/2015/wordml/symex" xmlns:wpg="http://schemas.microsoft.com/office/word/2010/wordprocessingGroup" xmlns:wpi="http://schemas.microsoft.com/office/word/2010/wordprocessingInk" xmlns:wne="http://schemas.microsoft.com/office/word/2006/wordml" xmlns:wps="http://schemas.microsoft.com/office/word/2010/wordprocessingShape" mc:Ignorable="w14 w15 w16se w16cid w16 w16cex w16sdtdh wp14">
+<w:document xmlns:wpc="http://schemas.microsoft.com/office/word/2010/wordprocessingCanvas" xmlns:cx="http://schemas.microsoft.com/office/drawing/2014/chartex" xmlns:cx1="http://schemas.microsoft.com/office/drawing/2015/9/8/chartex" xmlns:cx2="http://schemas.microsoft.com/office/drawing/2015/10/21/chartex" xmlns:cx3="http://schemas.microsoft.com/office/drawing/2016/5/9/chartex" xmlns:cx4="http://schemas.microsoft.com/office/drawing/2016/5/10/chartex" xmlns:cx5="http://schemas.microsoft.com/office/drawing/2016/5/11/chartex" xmlns:cx6="http://schemas.microsoft.com/office/drawing/2016/5/12/chartex" xmlns:cx7="http://schemas.microsoft.com/office/drawing/2016/5/13/chartex" xmlns:cx8="http://schemas.microsoft.com/office/drawing/2016/5/14/chartex" xmlns:mc="http://schemas.openxmlformats.org/markup-compatibility/2006" xmlns:aink="http://schemas.microsoft.com/office/drawing/2016/ink" xmlns:am3d="http://schemas.microsoft.com/office/drawing/2017/model3d" xmlns:o="urn:schemas-microsoft-com:office:office" xmlns:oel="http://schemas.microsoft.com/office/2019/extlst" xmlns:r="http://schemas.openxmlformats.org/officeDocument/2006/relationships" xmlns:m="http://schemas.openxmlformats.org/officeDocument/2006/math" xmlns:v="urn:schemas-microsoft-com:vml" xmlns:wp14="http://schemas.microsoft.com/office/word/2010/wordprocessingDrawing" xmlns:wp="http://schemas.openxmlformats.org/drawingml/2006/wordprocessingDrawing" xmlns:w10="urn:schemas-microsoft-com:office:word" xmlns:w="http://schemas.openxmlformats.org/wordprocessingml/2006/main" xmlns:w14="http://schemas.microsoft.com/office/word/2010/wordml" xmlns:w15="http://schemas.microsoft.com/office/word/2012/wordml" xmlns:w16cex="http://schemas.microsoft.com/office/word/2018/wordml/cex" xmlns:w16cid="http://schemas.microsoft.com/office/word/2016/wordml/cid" xmlns:w16="http://schemas.microsoft.com/office/word/2018/wordml" xmlns:w16du="http://schemas.microsoft.com/office/word/2023/wordml/word16du" xmlns:w16sdtdh="http://schemas.microsoft.com/office/word/2020/wordml/sdtdatahash" xmlns:w16se="http://schemas.microsoft.com/office/word/2015/wordml/symex" xmlns:wpg="http://schemas.microsoft.com/office/word/2010/wordprocessingGroup" xmlns:wpi="http://schemas.microsoft.com/office/word/2010/wordprocessingInk" xmlns:wne="http://schemas.microsoft.com/office/word/2006/wordml" xmlns:wps="http://schemas.microsoft.com/office/word/2010/wordprocessingShape" mc:Ignorable="w14 w15 w16se w16cid w16 w16cex w16sdtdh w16du wp14">
   <w:body>
     <w:p>
       <w:pPr>
         <w:spacing w:before="29"/>
-        <w:ind w:right="115"/>
-        <w:jc w:val="right"/>
+        <w:ind w:left="720" w:right="115" w:firstLine="720"/>
+        <w:rPr>
+          <w:b/>
+          <w:bCs/>
+        </w:rPr>
       </w:pPr>
       <w:r>
         <w:rPr>
+          <w:b/>
+          <w:bCs/>
           <w:noProof/>
         </w:rPr>
         <mc:AlternateContent>
@@ -408,6 +413,8 @@
       </w:r>
       <w:r>
         <w:rPr>
+          <w:b/>
+          <w:bCs/>
           <w:noProof/>
         </w:rPr>
         <mc:AlternateContent>
@@ -920,6 +927,8 @@
       </w:r>
       <w:r>
         <w:rPr>
+          <w:b/>
+          <w:bCs/>
           <w:noProof/>
         </w:rPr>
         <mc:AlternateContent>
@@ -1491,76 +1500,85 @@
         </mc:AlternateContent>
       </w:r>
       <w:r>
-        <w:t>Lampiran</w:t>
-      </w:r>
-      <w:r>
         <w:rPr>
+          <w:b/>
+          <w:bCs/>
+        </w:rPr>
+        <w:t>MAKLUMAT</w:t>
+      </w:r>
+      <w:r>
+        <w:rPr>
+          <w:b/>
+          <w:bCs/>
           <w:spacing w:val="-2"/>
         </w:rPr>
         <w:t xml:space="preserve"> </w:t>
       </w:r>
       <w:r>
-        <w:t>A</w:t>
-      </w:r>
-    </w:p>
-    <w:p>
-      <w:pPr>
-        <w:spacing w:before="2"/>
         <w:rPr>
-          <w:sz w:val="23"/>
+          <w:b/>
+          <w:bCs/>
         </w:rPr>
-      </w:pPr>
-    </w:p>
-    <w:p>
-      <w:pPr>
-        <w:pStyle w:val="Title"/>
-      </w:pPr>
-      <w:r>
-        <w:t>MAKLUMAT</w:t>
+        <w:t>KEWANGAN</w:t>
       </w:r>
       <w:r>
         <w:rPr>
+          <w:b/>
+          <w:bCs/>
+          <w:spacing w:val="-4"/>
+        </w:rPr>
+        <w:t xml:space="preserve"> </w:t>
+      </w:r>
+      <w:r>
+        <w:rPr>
+          <w:b/>
+          <w:bCs/>
+        </w:rPr>
+        <w:t>AGIHAN</w:t>
+      </w:r>
+      <w:r>
+        <w:rPr>
+          <w:b/>
+          <w:bCs/>
+          <w:spacing w:val="-3"/>
+        </w:rPr>
+        <w:t xml:space="preserve"> </w:t>
+      </w:r>
+      <w:r>
+        <w:rPr>
+          <w:b/>
+          <w:bCs/>
+        </w:rPr>
+        <w:t>DANA</w:t>
+      </w:r>
+      <w:r>
+        <w:rPr>
+          <w:b/>
+          <w:bCs/>
           <w:spacing w:val="-2"/>
         </w:rPr>
         <w:t xml:space="preserve"> </w:t>
       </w:r>
       <w:r>
-        <w:t>KEWANGAN</w:t>
-      </w:r>
-      <w:r>
         <w:rPr>
-          <w:spacing w:val="-4"/>
+          <w:b/>
+          <w:bCs/>
         </w:rPr>
-        <w:t xml:space="preserve"> </w:t>
-      </w:r>
-      <w:r>
-        <w:t>AGIHAN</w:t>
+        <w:t>UNIVERSITI</w:t>
       </w:r>
       <w:r>
         <w:rPr>
+          <w:b/>
+          <w:bCs/>
           <w:spacing w:val="-3"/>
         </w:rPr>
         <w:t xml:space="preserve"> </w:t>
       </w:r>
       <w:r>
-        <w:t>DANA</w:t>
-      </w:r>
-      <w:r>
         <w:rPr>
-          <w:spacing w:val="-2"/>
+          <w:b/>
+          <w:bCs/>
         </w:rPr>
-        <w:t xml:space="preserve"> </w:t>
-      </w:r>
-      <w:r>
-        <w:t>UNIVERSITI</w:t>
-      </w:r>
-      <w:r>
-        <w:rPr>
-          <w:spacing w:val="-3"/>
-        </w:rPr>
-        <w:t xml:space="preserve"> </w:t>
-      </w:r>
-      <w:r>
         <w:t>PENYELIDIKAN</w:t>
       </w:r>
     </w:p>
@@ -3212,7 +3230,7 @@
       </w:tr>
       <w:tr>
         <w:trPr>
-          <w:trHeight w:val="3420"/>
+          <w:trHeight w:val="3047"/>
         </w:trPr>
         <w:tc>
           <w:tcPr>
@@ -3741,6 +3759,8 @@
           <w:sz w:val="20"/>
         </w:rPr>
         <w:sectPr>
+          <w:headerReference w:type="default" r:id="rId8"/>
+          <w:footerReference w:type="default" r:id="rId9"/>
           <w:type w:val="continuous"/>
           <w:pgSz w:w="11910" w:h="16840"/>
           <w:pgMar w:top="660" w:right="1320" w:bottom="280" w:left="1340" w:header="720" w:footer="720" w:gutter="0"/>
@@ -3986,8 +4006,83 @@
 </w:document>
 </file>
 
+<file path=word/endnotes.xml><?xml version="1.0" encoding="utf-8"?>
+<w:endnotes xmlns:wpc="http://schemas.microsoft.com/office/word/2010/wordprocessingCanvas" xmlns:cx="http://schemas.microsoft.com/office/drawing/2014/chartex" xmlns:cx1="http://schemas.microsoft.com/office/drawing/2015/9/8/chartex" xmlns:cx2="http://schemas.microsoft.com/office/drawing/2015/10/21/chartex" xmlns:cx3="http://schemas.microsoft.com/office/drawing/2016/5/9/chartex" xmlns:cx4="http://schemas.microsoft.com/office/drawing/2016/5/10/chartex" xmlns:cx5="http://schemas.microsoft.com/office/drawing/2016/5/11/chartex" xmlns:cx6="http://schemas.microsoft.com/office/drawing/2016/5/12/chartex" xmlns:cx7="http://schemas.microsoft.com/office/drawing/2016/5/13/chartex" xmlns:cx8="http://schemas.microsoft.com/office/drawing/2016/5/14/chartex" xmlns:mc="http://schemas.openxmlformats.org/markup-compatibility/2006" xmlns:aink="http://schemas.microsoft.com/office/drawing/2016/ink" xmlns:am3d="http://schemas.microsoft.com/office/drawing/2017/model3d" xmlns:o="urn:schemas-microsoft-com:office:office" xmlns:oel="http://schemas.microsoft.com/office/2019/extlst" xmlns:r="http://schemas.openxmlformats.org/officeDocument/2006/relationships" xmlns:m="http://schemas.openxmlformats.org/officeDocument/2006/math" xmlns:v="urn:schemas-microsoft-com:vml" xmlns:wp14="http://schemas.microsoft.com/office/word/2010/wordprocessingDrawing" xmlns:wp="http://schemas.openxmlformats.org/drawingml/2006/wordprocessingDrawing" xmlns:w10="urn:schemas-microsoft-com:office:word" xmlns:w="http://schemas.openxmlformats.org/wordprocessingml/2006/main" xmlns:w14="http://schemas.microsoft.com/office/word/2010/wordml" xmlns:w15="http://schemas.microsoft.com/office/word/2012/wordml" xmlns:w16cex="http://schemas.microsoft.com/office/word/2018/wordml/cex" xmlns:w16cid="http://schemas.microsoft.com/office/word/2016/wordml/cid" xmlns:w16="http://schemas.microsoft.com/office/word/2018/wordml" xmlns:w16du="http://schemas.microsoft.com/office/word/2023/wordml/word16du" xmlns:w16sdtdh="http://schemas.microsoft.com/office/word/2020/wordml/sdtdatahash" xmlns:w16se="http://schemas.microsoft.com/office/word/2015/wordml/symex" xmlns:wpg="http://schemas.microsoft.com/office/word/2010/wordprocessingGroup" xmlns:wpi="http://schemas.microsoft.com/office/word/2010/wordprocessingInk" xmlns:wne="http://schemas.microsoft.com/office/word/2006/wordml" xmlns:wps="http://schemas.microsoft.com/office/word/2010/wordprocessingShape" mc:Ignorable="w14 w15 w16se w16cid w16 w16cex w16sdtdh w16du wp14">
+  <w:endnote w:type="separator" w:id="-1">
+    <w:p>
+      <w:r>
+        <w:separator/>
+      </w:r>
+    </w:p>
+  </w:endnote>
+  <w:endnote w:type="continuationSeparator" w:id="0">
+    <w:p>
+      <w:r>
+        <w:continuationSeparator/>
+      </w:r>
+    </w:p>
+  </w:endnote>
+</w:endnotes>
+</file>
+
+<file path=word/footer1.xml><?xml version="1.0" encoding="utf-8"?>
+<w:ftr xmlns:wpc="http://schemas.microsoft.com/office/word/2010/wordprocessingCanvas" xmlns:cx="http://schemas.microsoft.com/office/drawing/2014/chartex" xmlns:cx1="http://schemas.microsoft.com/office/drawing/2015/9/8/chartex" xmlns:cx2="http://schemas.microsoft.com/office/drawing/2015/10/21/chartex" xmlns:cx3="http://schemas.microsoft.com/office/drawing/2016/5/9/chartex" xmlns:cx4="http://schemas.microsoft.com/office/drawing/2016/5/10/chartex" xmlns:cx5="http://schemas.microsoft.com/office/drawing/2016/5/11/chartex" xmlns:cx6="http://schemas.microsoft.com/office/drawing/2016/5/12/chartex" xmlns:cx7="http://schemas.microsoft.com/office/drawing/2016/5/13/chartex" xmlns:cx8="http://schemas.microsoft.com/office/drawing/2016/5/14/chartex" xmlns:mc="http://schemas.openxmlformats.org/markup-compatibility/2006" xmlns:aink="http://schemas.microsoft.com/office/drawing/2016/ink" xmlns:am3d="http://schemas.microsoft.com/office/drawing/2017/model3d" xmlns:o="urn:schemas-microsoft-com:office:office" xmlns:oel="http://schemas.microsoft.com/office/2019/extlst" xmlns:r="http://schemas.openxmlformats.org/officeDocument/2006/relationships" xmlns:m="http://schemas.openxmlformats.org/officeDocument/2006/math" xmlns:v="urn:schemas-microsoft-com:vml" xmlns:wp14="http://schemas.microsoft.com/office/word/2010/wordprocessingDrawing" xmlns:wp="http://schemas.openxmlformats.org/drawingml/2006/wordprocessingDrawing" xmlns:w10="urn:schemas-microsoft-com:office:word" xmlns:w="http://schemas.openxmlformats.org/wordprocessingml/2006/main" xmlns:w14="http://schemas.microsoft.com/office/word/2010/wordml" xmlns:w15="http://schemas.microsoft.com/office/word/2012/wordml" xmlns:w16cex="http://schemas.microsoft.com/office/word/2018/wordml/cex" xmlns:w16cid="http://schemas.microsoft.com/office/word/2016/wordml/cid" xmlns:w16="http://schemas.microsoft.com/office/word/2018/wordml" xmlns:w16du="http://schemas.microsoft.com/office/word/2023/wordml/word16du" xmlns:w16sdtdh="http://schemas.microsoft.com/office/word/2020/wordml/sdtdatahash" xmlns:w16se="http://schemas.microsoft.com/office/word/2015/wordml/symex" xmlns:wpg="http://schemas.microsoft.com/office/word/2010/wordprocessingGroup" xmlns:wpi="http://schemas.microsoft.com/office/word/2010/wordprocessingInk" xmlns:wne="http://schemas.microsoft.com/office/word/2006/wordml" xmlns:wps="http://schemas.microsoft.com/office/word/2010/wordprocessingShape" mc:Ignorable="w14 w15 w16se w16cid w16 w16cex w16sdtdh w16du wp14">
+  <w:p>
+    <w:pPr>
+      <w:pStyle w:val="Footer"/>
+      <w:jc w:val="center"/>
+    </w:pPr>
+    <w:r>
+      <w:rPr>
+        <w:b/>
+        <w:bCs/>
+      </w:rPr>
+      <w:t>***Ini adalah cetakan komputer dan tidak memerlukan tandatangan fizikal.***</w:t>
+    </w:r>
+  </w:p>
+</w:ftr>
+</file>
+
+<file path=word/footnotes.xml><?xml version="1.0" encoding="utf-8"?>
+<w:footnotes xmlns:wpc="http://schemas.microsoft.com/office/word/2010/wordprocessingCanvas" xmlns:cx="http://schemas.microsoft.com/office/drawing/2014/chartex" xmlns:cx1="http://schemas.microsoft.com/office/drawing/2015/9/8/chartex" xmlns:cx2="http://schemas.microsoft.com/office/drawing/2015/10/21/chartex" xmlns:cx3="http://schemas.microsoft.com/office/drawing/2016/5/9/chartex" xmlns:cx4="http://schemas.microsoft.com/office/drawing/2016/5/10/chartex" xmlns:cx5="http://schemas.microsoft.com/office/drawing/2016/5/11/chartex" xmlns:cx6="http://schemas.microsoft.com/office/drawing/2016/5/12/chartex" xmlns:cx7="http://schemas.microsoft.com/office/drawing/2016/5/13/chartex" xmlns:cx8="http://schemas.microsoft.com/office/drawing/2016/5/14/chartex" xmlns:mc="http://schemas.openxmlformats.org/markup-compatibility/2006" xmlns:aink="http://schemas.microsoft.com/office/drawing/2016/ink" xmlns:am3d="http://schemas.microsoft.com/office/drawing/2017/model3d" xmlns:o="urn:schemas-microsoft-com:office:office" xmlns:oel="http://schemas.microsoft.com/office/2019/extlst" xmlns:r="http://schemas.openxmlformats.org/officeDocument/2006/relationships" xmlns:m="http://schemas.openxmlformats.org/officeDocument/2006/math" xmlns:v="urn:schemas-microsoft-com:vml" xmlns:wp14="http://schemas.microsoft.com/office/word/2010/wordprocessingDrawing" xmlns:wp="http://schemas.openxmlformats.org/drawingml/2006/wordprocessingDrawing" xmlns:w10="urn:schemas-microsoft-com:office:word" xmlns:w="http://schemas.openxmlformats.org/wordprocessingml/2006/main" xmlns:w14="http://schemas.microsoft.com/office/word/2010/wordml" xmlns:w15="http://schemas.microsoft.com/office/word/2012/wordml" xmlns:w16cex="http://schemas.microsoft.com/office/word/2018/wordml/cex" xmlns:w16cid="http://schemas.microsoft.com/office/word/2016/wordml/cid" xmlns:w16="http://schemas.microsoft.com/office/word/2018/wordml" xmlns:w16du="http://schemas.microsoft.com/office/word/2023/wordml/word16du" xmlns:w16sdtdh="http://schemas.microsoft.com/office/word/2020/wordml/sdtdatahash" xmlns:w16se="http://schemas.microsoft.com/office/word/2015/wordml/symex" xmlns:wpg="http://schemas.microsoft.com/office/word/2010/wordprocessingGroup" xmlns:wpi="http://schemas.microsoft.com/office/word/2010/wordprocessingInk" xmlns:wne="http://schemas.microsoft.com/office/word/2006/wordml" xmlns:wps="http://schemas.microsoft.com/office/word/2010/wordprocessingShape" mc:Ignorable="w14 w15 w16se w16cid w16 w16cex w16sdtdh w16du wp14">
+  <w:footnote w:type="separator" w:id="-1">
+    <w:p>
+      <w:r>
+        <w:separator/>
+      </w:r>
+    </w:p>
+  </w:footnote>
+  <w:footnote w:type="continuationSeparator" w:id="0">
+    <w:p>
+      <w:r>
+        <w:continuationSeparator/>
+      </w:r>
+    </w:p>
+  </w:footnote>
+</w:footnotes>
+</file>
+
+<file path=word/header1.xml><?xml version="1.0" encoding="utf-8"?>
+<w:hdr xmlns:wpc="http://schemas.microsoft.com/office/word/2010/wordprocessingCanvas" xmlns:cx="http://schemas.microsoft.com/office/drawing/2014/chartex" xmlns:cx1="http://schemas.microsoft.com/office/drawing/2015/9/8/chartex" xmlns:cx2="http://schemas.microsoft.com/office/drawing/2015/10/21/chartex" xmlns:cx3="http://schemas.microsoft.com/office/drawing/2016/5/9/chartex" xmlns:cx4="http://schemas.microsoft.com/office/drawing/2016/5/10/chartex" xmlns:cx5="http://schemas.microsoft.com/office/drawing/2016/5/11/chartex" xmlns:cx6="http://schemas.microsoft.com/office/drawing/2016/5/12/chartex" xmlns:cx7="http://schemas.microsoft.com/office/drawing/2016/5/13/chartex" xmlns:cx8="http://schemas.microsoft.com/office/drawing/2016/5/14/chartex" xmlns:mc="http://schemas.openxmlformats.org/markup-compatibility/2006" xmlns:aink="http://schemas.microsoft.com/office/drawing/2016/ink" xmlns:am3d="http://schemas.microsoft.com/office/drawing/2017/model3d" xmlns:o="urn:schemas-microsoft-com:office:office" xmlns:oel="http://schemas.microsoft.com/office/2019/extlst" xmlns:r="http://schemas.openxmlformats.org/officeDocument/2006/relationships" xmlns:m="http://schemas.openxmlformats.org/officeDocument/2006/math" xmlns:v="urn:schemas-microsoft-com:vml" xmlns:wp14="http://schemas.microsoft.com/office/word/2010/wordprocessingDrawing" xmlns:wp="http://schemas.openxmlformats.org/drawingml/2006/wordprocessingDrawing" xmlns:w10="urn:schemas-microsoft-com:office:word" xmlns:w="http://schemas.openxmlformats.org/wordprocessingml/2006/main" xmlns:w14="http://schemas.microsoft.com/office/word/2010/wordml" xmlns:w15="http://schemas.microsoft.com/office/word/2012/wordml" xmlns:w16cex="http://schemas.microsoft.com/office/word/2018/wordml/cex" xmlns:w16cid="http://schemas.microsoft.com/office/word/2016/wordml/cid" xmlns:w16="http://schemas.microsoft.com/office/word/2018/wordml" xmlns:w16du="http://schemas.microsoft.com/office/word/2023/wordml/word16du" xmlns:w16sdtdh="http://schemas.microsoft.com/office/word/2020/wordml/sdtdatahash" xmlns:w16se="http://schemas.microsoft.com/office/word/2015/wordml/symex" xmlns:wpg="http://schemas.microsoft.com/office/word/2010/wordprocessingGroup" xmlns:wpi="http://schemas.microsoft.com/office/word/2010/wordprocessingInk" xmlns:wne="http://schemas.microsoft.com/office/word/2006/wordml" xmlns:wps="http://schemas.microsoft.com/office/word/2010/wordprocessingShape" mc:Ignorable="w14 w15 w16se w16cid w16 w16cex w16sdtdh w16du wp14">
+  <w:p>
+    <w:pPr>
+      <w:pStyle w:val="Header"/>
+      <w:jc w:val="right"/>
+    </w:pPr>
+    <w:r>
+      <w:t>Lampiran A</w:t>
+    </w:r>
+  </w:p>
+  <w:p>
+    <w:pPr>
+      <w:pStyle w:val="Header"/>
+    </w:pPr>
+  </w:p>
+</w:hdr>
+</file>
+
 <file path=word/numbering.xml><?xml version="1.0" encoding="utf-8"?>
-<w:numbering xmlns:wpc="http://schemas.microsoft.com/office/word/2010/wordprocessingCanvas" xmlns:cx="http://schemas.microsoft.com/office/drawing/2014/chartex" xmlns:cx1="http://schemas.microsoft.com/office/drawing/2015/9/8/chartex" xmlns:cx2="http://schemas.microsoft.com/office/drawing/2015/10/21/chartex" xmlns:cx3="http://schemas.microsoft.com/office/drawing/2016/5/9/chartex" xmlns:cx4="http://schemas.microsoft.com/office/drawing/2016/5/10/chartex" xmlns:cx5="http://schemas.microsoft.com/office/drawing/2016/5/11/chartex" xmlns:cx6="http://schemas.microsoft.com/office/drawing/2016/5/12/chartex" xmlns:cx7="http://schemas.microsoft.com/office/drawing/2016/5/13/chartex" xmlns:cx8="http://schemas.microsoft.com/office/drawing/2016/5/14/chartex" xmlns:mc="http://schemas.openxmlformats.org/markup-compatibility/2006" xmlns:aink="http://schemas.microsoft.com/office/drawing/2016/ink" xmlns:am3d="http://schemas.microsoft.com/office/drawing/2017/model3d" xmlns:o="urn:schemas-microsoft-com:office:office" xmlns:oel="http://schemas.microsoft.com/office/2019/extlst" xmlns:r="http://schemas.openxmlformats.org/officeDocument/2006/relationships" xmlns:m="http://schemas.openxmlformats.org/officeDocument/2006/math" xmlns:v="urn:schemas-microsoft-com:vml" xmlns:wp14="http://schemas.microsoft.com/office/word/2010/wordprocessingDrawing" xmlns:wp="http://schemas.openxmlformats.org/drawingml/2006/wordprocessingDrawing" xmlns:w10="urn:schemas-microsoft-com:office:word" xmlns:w="http://schemas.openxmlformats.org/wordprocessingml/2006/main" xmlns:w14="http://schemas.microsoft.com/office/word/2010/wordml" xmlns:w15="http://schemas.microsoft.com/office/word/2012/wordml" xmlns:w16cex="http://schemas.microsoft.com/office/word/2018/wordml/cex" xmlns:w16cid="http://schemas.microsoft.com/office/word/2016/wordml/cid" xmlns:w16="http://schemas.microsoft.com/office/word/2018/wordml" xmlns:w16sdtdh="http://schemas.microsoft.com/office/word/2020/wordml/sdtdatahash" xmlns:w16se="http://schemas.microsoft.com/office/word/2015/wordml/symex" xmlns:wpg="http://schemas.microsoft.com/office/word/2010/wordprocessingGroup" xmlns:wpi="http://schemas.microsoft.com/office/word/2010/wordprocessingInk" xmlns:wne="http://schemas.microsoft.com/office/word/2006/wordml" xmlns:wps="http://schemas.microsoft.com/office/word/2010/wordprocessingShape" mc:Ignorable="w14 w15 w16se w16cid w16 w16cex w16sdtdh wp14">
+<w:numbering xmlns:wpc="http://schemas.microsoft.com/office/word/2010/wordprocessingCanvas" xmlns:cx="http://schemas.microsoft.com/office/drawing/2014/chartex" xmlns:cx1="http://schemas.microsoft.com/office/drawing/2015/9/8/chartex" xmlns:cx2="http://schemas.microsoft.com/office/drawing/2015/10/21/chartex" xmlns:cx3="http://schemas.microsoft.com/office/drawing/2016/5/9/chartex" xmlns:cx4="http://schemas.microsoft.com/office/drawing/2016/5/10/chartex" xmlns:cx5="http://schemas.microsoft.com/office/drawing/2016/5/11/chartex" xmlns:cx6="http://schemas.microsoft.com/office/drawing/2016/5/12/chartex" xmlns:cx7="http://schemas.microsoft.com/office/drawing/2016/5/13/chartex" xmlns:cx8="http://schemas.microsoft.com/office/drawing/2016/5/14/chartex" xmlns:mc="http://schemas.openxmlformats.org/markup-compatibility/2006" xmlns:aink="http://schemas.microsoft.com/office/drawing/2016/ink" xmlns:am3d="http://schemas.microsoft.com/office/drawing/2017/model3d" xmlns:o="urn:schemas-microsoft-com:office:office" xmlns:oel="http://schemas.microsoft.com/office/2019/extlst" xmlns:r="http://schemas.openxmlformats.org/officeDocument/2006/relationships" xmlns:m="http://schemas.openxmlformats.org/officeDocument/2006/math" xmlns:v="urn:schemas-microsoft-com:vml" xmlns:wp14="http://schemas.microsoft.com/office/word/2010/wordprocessingDrawing" xmlns:wp="http://schemas.openxmlformats.org/drawingml/2006/wordprocessingDrawing" xmlns:w10="urn:schemas-microsoft-com:office:word" xmlns:w="http://schemas.openxmlformats.org/wordprocessingml/2006/main" xmlns:w14="http://schemas.microsoft.com/office/word/2010/wordml" xmlns:w15="http://schemas.microsoft.com/office/word/2012/wordml" xmlns:w16cex="http://schemas.microsoft.com/office/word/2018/wordml/cex" xmlns:w16cid="http://schemas.microsoft.com/office/word/2016/wordml/cid" xmlns:w16="http://schemas.microsoft.com/office/word/2018/wordml" xmlns:w16du="http://schemas.microsoft.com/office/word/2023/wordml/word16du" xmlns:w16sdtdh="http://schemas.microsoft.com/office/word/2020/wordml/sdtdatahash" xmlns:w16se="http://schemas.microsoft.com/office/word/2015/wordml/symex" xmlns:wpg="http://schemas.microsoft.com/office/word/2010/wordprocessingGroup" xmlns:wpi="http://schemas.microsoft.com/office/word/2010/wordprocessingInk" xmlns:wne="http://schemas.microsoft.com/office/word/2006/wordml" xmlns:wps="http://schemas.microsoft.com/office/word/2010/wordprocessingShape" mc:Ignorable="w14 w15 w16se w16cid w16 w16cex w16sdtdh w16du wp14">
   <w:abstractNum w:abstractNumId="0" w15:restartNumberingAfterBreak="0">
     <w:nsid w:val="2D8C0BC2"/>
     <w:multiLevelType w:val="hybridMultilevel"/>
@@ -4235,7 +4330,7 @@
 </file>
 
 <file path=word/styles.xml><?xml version="1.0" encoding="utf-8"?>
-<w:styles xmlns:mc="http://schemas.openxmlformats.org/markup-compatibility/2006" xmlns:r="http://schemas.openxmlformats.org/officeDocument/2006/relationships" xmlns:w="http://schemas.openxmlformats.org/wordprocessingml/2006/main" xmlns:w14="http://schemas.microsoft.com/office/word/2010/wordml" xmlns:w15="http://schemas.microsoft.com/office/word/2012/wordml" xmlns:w16cex="http://schemas.microsoft.com/office/word/2018/wordml/cex" xmlns:w16cid="http://schemas.microsoft.com/office/word/2016/wordml/cid" xmlns:w16="http://schemas.microsoft.com/office/word/2018/wordml" xmlns:w16sdtdh="http://schemas.microsoft.com/office/word/2020/wordml/sdtdatahash" xmlns:w16se="http://schemas.microsoft.com/office/word/2015/wordml/symex" mc:Ignorable="w14 w15 w16se w16cid w16 w16cex w16sdtdh">
+<w:styles xmlns:mc="http://schemas.openxmlformats.org/markup-compatibility/2006" xmlns:r="http://schemas.openxmlformats.org/officeDocument/2006/relationships" xmlns:w="http://schemas.openxmlformats.org/wordprocessingml/2006/main" xmlns:w14="http://schemas.microsoft.com/office/word/2010/wordml" xmlns:w15="http://schemas.microsoft.com/office/word/2012/wordml" xmlns:w16cex="http://schemas.microsoft.com/office/word/2018/wordml/cex" xmlns:w16cid="http://schemas.microsoft.com/office/word/2016/wordml/cid" xmlns:w16="http://schemas.microsoft.com/office/word/2018/wordml" xmlns:w16du="http://schemas.microsoft.com/office/word/2023/wordml/word16du" xmlns:w16sdtdh="http://schemas.microsoft.com/office/word/2020/wordml/sdtdatahash" xmlns:w16se="http://schemas.microsoft.com/office/word/2015/wordml/symex" mc:Ignorable="w14 w15 w16se w16cid w16 w16cex w16sdtdh w16du">
   <w:docDefaults>
     <w:rPrDefault>
       <w:rPr>
@@ -4642,7 +4737,6 @@
   <w:style w:type="character" w:default="1" w:styleId="DefaultParagraphFont">
     <w:name w:val="Default Paragraph Font"/>
     <w:uiPriority w:val="1"/>
-    <w:semiHidden/>
     <w:unhideWhenUsed/>
   </w:style>
   <w:style w:type="table" w:default="1" w:styleId="TableNormal">
@@ -4711,6 +4805,56 @@
       <w:spacing w:before="1"/>
       <w:ind w:left="107"/>
     </w:pPr>
+  </w:style>
+  <w:style w:type="paragraph" w:styleId="Header">
+    <w:name w:val="header"/>
+    <w:basedOn w:val="Normal"/>
+    <w:link w:val="HeaderChar"/>
+    <w:uiPriority w:val="99"/>
+    <w:unhideWhenUsed/>
+    <w:rsid w:val="001E4DFF"/>
+    <w:pPr>
+      <w:tabs>
+        <w:tab w:val="center" w:pos="4513"/>
+        <w:tab w:val="right" w:pos="9026"/>
+      </w:tabs>
+    </w:pPr>
+  </w:style>
+  <w:style w:type="character" w:customStyle="1" w:styleId="HeaderChar">
+    <w:name w:val="Header Char"/>
+    <w:basedOn w:val="DefaultParagraphFont"/>
+    <w:link w:val="Header"/>
+    <w:uiPriority w:val="99"/>
+    <w:rsid w:val="001E4DFF"/>
+    <w:rPr>
+      <w:rFonts w:ascii="Candara" w:eastAsia="Candara" w:hAnsi="Candara" w:cs="Candara"/>
+      <w:lang w:val="ms"/>
+    </w:rPr>
+  </w:style>
+  <w:style w:type="paragraph" w:styleId="Footer">
+    <w:name w:val="footer"/>
+    <w:basedOn w:val="Normal"/>
+    <w:link w:val="FooterChar"/>
+    <w:uiPriority w:val="99"/>
+    <w:unhideWhenUsed/>
+    <w:rsid w:val="001E4DFF"/>
+    <w:pPr>
+      <w:tabs>
+        <w:tab w:val="center" w:pos="4513"/>
+        <w:tab w:val="right" w:pos="9026"/>
+      </w:tabs>
+    </w:pPr>
+  </w:style>
+  <w:style w:type="character" w:customStyle="1" w:styleId="FooterChar">
+    <w:name w:val="Footer Char"/>
+    <w:basedOn w:val="DefaultParagraphFont"/>
+    <w:link w:val="Footer"/>
+    <w:uiPriority w:val="99"/>
+    <w:rsid w:val="001E4DFF"/>
+    <w:rPr>
+      <w:rFonts w:ascii="Candara" w:eastAsia="Candara" w:hAnsi="Candara" w:cs="Candara"/>
+      <w:lang w:val="ms"/>
+    </w:rPr>
   </w:style>
 </w:styles>
 </file>
@@ -4996,4 +5140,16 @@
   <a:objectDefaults/>
   <a:extraClrSchemeLst/>
 </a:theme>
+</file>
+
+<file path=customXml/item1.xml><?xml version="1.0" encoding="utf-8"?>
+<b:Sources xmlns:b="http://schemas.openxmlformats.org/officeDocument/2006/bibliography" xmlns="http://schemas.openxmlformats.org/officeDocument/2006/bibliography" SelectedStyle="\APASixthEditionOfficeOnline.xsl" StyleName="APA" Version="6"/>
+</file>
+
+<file path=customXml/itemProps1.xml><?xml version="1.0" encoding="utf-8"?>
+<ds:datastoreItem xmlns:ds="http://schemas.openxmlformats.org/officeDocument/2006/customXml" ds:itemID="{E8485090-B5BA-4D8B-AC62-E4FC1B31745B}">
+  <ds:schemaRefs>
+    <ds:schemaRef ds:uri="http://schemas.openxmlformats.org/officeDocument/2006/bibliography"/>
+  </ds:schemaRefs>
+</ds:datastoreItem>
 </file>
</xml_diff>